<commit_message>
cập nhật lược đồ ngoại khóa của cơ sở dữ liệu
</commit_message>
<xml_diff>
--- a/Sổ Sách Quản Lý Bất Động Sản & Cho Thuê (giai đoạn 2).docx
+++ b/Sổ Sách Quản Lý Bất Động Sản & Cho Thuê (giai đoạn 2).docx
@@ -16937,9 +16937,6 @@
       <w:pPr>
         <w:ind w:left="1700" w:hanging="300"/>
         <w:jc w:val="both"/>
-        <w:rPr>
-          <w:lang w:val="en-US"/>
-        </w:rPr>
       </w:pPr>
       <w:r>
         <w:rPr>
@@ -17037,81 +17034,51 @@
     <w:p>
       <w:pPr>
         <w:jc w:val="both"/>
-        <w:rPr>
-          <w:lang w:val="en-US"/>
-        </w:rPr>
       </w:pPr>
     </w:p>
     <w:p>
       <w:pPr>
         <w:jc w:val="both"/>
-        <w:rPr>
-          <w:lang w:val="en-US"/>
-        </w:rPr>
       </w:pPr>
     </w:p>
     <w:p>
       <w:pPr>
         <w:jc w:val="both"/>
-        <w:rPr>
-          <w:lang w:val="en-US"/>
-        </w:rPr>
       </w:pPr>
     </w:p>
     <w:p>
       <w:pPr>
         <w:jc w:val="both"/>
-        <w:rPr>
-          <w:lang w:val="en-US"/>
-        </w:rPr>
       </w:pPr>
     </w:p>
     <w:p>
       <w:pPr>
         <w:jc w:val="both"/>
-        <w:rPr>
-          <w:lang w:val="en-US"/>
-        </w:rPr>
       </w:pPr>
     </w:p>
     <w:p>
       <w:pPr>
         <w:jc w:val="both"/>
-        <w:rPr>
-          <w:lang w:val="en-US"/>
-        </w:rPr>
       </w:pPr>
     </w:p>
     <w:p>
       <w:pPr>
         <w:jc w:val="both"/>
-        <w:rPr>
-          <w:lang w:val="en-US"/>
-        </w:rPr>
       </w:pPr>
     </w:p>
     <w:p>
       <w:pPr>
         <w:jc w:val="both"/>
-        <w:rPr>
-          <w:lang w:val="en-US"/>
-        </w:rPr>
       </w:pPr>
     </w:p>
     <w:p>
       <w:pPr>
         <w:jc w:val="both"/>
-        <w:rPr>
-          <w:lang w:val="en-US"/>
-        </w:rPr>
       </w:pPr>
     </w:p>
     <w:p>
       <w:pPr>
         <w:jc w:val="both"/>
-        <w:rPr>
-          <w:lang w:val="en-US"/>
-        </w:rPr>
       </w:pPr>
     </w:p>
     <w:p>
@@ -22421,84 +22388,143 @@
     </w:tbl>
     <w:p>
       <w:pPr>
+        <w:jc w:val="both"/>
         <w:rPr>
           <w:sz w:val="20"/>
           <w:szCs w:val="20"/>
-        </w:rPr>
-      </w:pPr>
-    </w:p>
-    <w:p>
-      <w:pPr>
+          <w:lang w:val="vi-VN"/>
+        </w:rPr>
+      </w:pPr>
+    </w:p>
+    <w:p>
+      <w:pPr>
+        <w:jc w:val="both"/>
         <w:rPr>
           <w:sz w:val="20"/>
           <w:szCs w:val="20"/>
-        </w:rPr>
-      </w:pPr>
-    </w:p>
-    <w:p>
-      <w:pPr>
-        <w:rPr>
-          <w:sz w:val="20"/>
-          <w:szCs w:val="20"/>
-        </w:rPr>
-      </w:pPr>
-    </w:p>
-    <w:p>
-      <w:pPr>
-        <w:rPr>
-          <w:sz w:val="20"/>
-          <w:szCs w:val="20"/>
-        </w:rPr>
-      </w:pPr>
-    </w:p>
-    <w:p>
-      <w:pPr>
-        <w:rPr>
-          <w:sz w:val="20"/>
-          <w:szCs w:val="20"/>
-        </w:rPr>
-      </w:pPr>
-    </w:p>
-    <w:p>
-      <w:pPr>
-        <w:rPr>
-          <w:sz w:val="20"/>
-          <w:szCs w:val="20"/>
-        </w:rPr>
-      </w:pPr>
-    </w:p>
-    <w:p>
-      <w:pPr>
-        <w:rPr>
-          <w:sz w:val="20"/>
-          <w:szCs w:val="20"/>
-        </w:rPr>
-      </w:pPr>
-    </w:p>
-    <w:p>
-      <w:pPr>
-        <w:rPr>
-          <w:sz w:val="20"/>
-          <w:szCs w:val="20"/>
-        </w:rPr>
-      </w:pPr>
-    </w:p>
-    <w:p>
-      <w:pPr>
-        <w:rPr>
-          <w:sz w:val="20"/>
-          <w:szCs w:val="20"/>
-        </w:rPr>
-      </w:pPr>
+          <w:lang w:val="vi-VN"/>
+        </w:rPr>
+      </w:pPr>
+    </w:p>
+    <w:p>
+      <w:pPr>
+        <w:ind w:left="720" w:firstLine="720"/>
+        <w:rPr>
+          <w:rFonts w:asciiTheme="majorHAnsi" w:hAnsiTheme="majorHAnsi" w:cstheme="majorHAnsi"/>
+          <w:sz w:val="28"/>
+          <w:szCs w:val="28"/>
+        </w:rPr>
+      </w:pPr>
+      <w:r>
+        <w:rPr>
+          <w:rFonts w:asciiTheme="majorHAnsi" w:hAnsiTheme="majorHAnsi" w:cstheme="majorHAnsi"/>
+          <w:b/>
+          <w:bCs/>
+          <w:sz w:val="28"/>
+          <w:szCs w:val="28"/>
+          <w:lang w:val="vi-VN"/>
+        </w:rPr>
+        <w:lastRenderedPageBreak/>
+        <w:t xml:space="preserve">C. </w:t>
+      </w:r>
+      <w:r>
+        <w:rPr>
+          <w:rFonts w:asciiTheme="majorHAnsi" w:hAnsiTheme="majorHAnsi" w:cstheme="majorHAnsi"/>
+          <w:b/>
+          <w:bCs/>
+          <w:sz w:val="28"/>
+          <w:szCs w:val="28"/>
+        </w:rPr>
+        <w:t>Lược đồ CSDL quan hệ:</w:t>
+      </w:r>
     </w:p>
     <w:p>
       <w:pPr>
         <w:ind w:left="1440"/>
         <w:rPr>
-          <w:b/>
-          <w:bCs/>
-        </w:rPr>
-      </w:pPr>
+          <w:rFonts w:asciiTheme="majorHAnsi" w:hAnsiTheme="majorHAnsi" w:cstheme="majorHAnsi"/>
+          <w:b/>
+          <w:bCs/>
+          <w:sz w:val="28"/>
+          <w:szCs w:val="28"/>
+        </w:rPr>
+      </w:pPr>
+      <w:hyperlink r:id="rId19">
+        <w:r>
+          <w:rPr>
+            <w:rFonts w:asciiTheme="majorHAnsi" w:hAnsiTheme="majorHAnsi" w:cstheme="majorHAnsi"/>
+            <w:b/>
+            <w:bCs/>
+            <w:color w:val="0000EE"/>
+            <w:sz w:val="28"/>
+            <w:szCs w:val="28"/>
+            <w:u w:val="single"/>
+          </w:rPr>
+          <w:t>Lược đồ CSDL quan hệ.png</w:t>
+        </w:r>
+      </w:hyperlink>
+    </w:p>
+    <w:p>
+      <w:pPr>
+        <w:ind w:left="1440"/>
+        <w:rPr>
+          <w:b/>
+          <w:bCs/>
+        </w:rPr>
+      </w:pPr>
+      <w:r>
+        <w:rPr>
+          <w:noProof/>
+        </w:rPr>
+        <w:drawing>
+          <wp:anchor distT="114300" distB="114300" distL="114300" distR="114300" simplePos="0" relativeHeight="251659264" behindDoc="0" locked="0" layoutInCell="1" hidden="0" allowOverlap="1" wp14:anchorId="76605ACD" wp14:editId="698870BE">
+            <wp:simplePos x="0" y="0"/>
+            <wp:positionH relativeFrom="column">
+              <wp:posOffset>-223837</wp:posOffset>
+            </wp:positionH>
+            <wp:positionV relativeFrom="paragraph">
+              <wp:posOffset>285750</wp:posOffset>
+            </wp:positionV>
+            <wp:extent cx="6323960" cy="6517353"/>
+            <wp:effectExtent l="12700" t="12700" r="12700" b="12700"/>
+            <wp:wrapSquare wrapText="bothSides" distT="114300" distB="114300" distL="114300" distR="114300"/>
+            <wp:docPr id="1576111028" name="image1.png"/>
+            <wp:cNvGraphicFramePr/>
+            <a:graphic xmlns:a="http://schemas.openxmlformats.org/drawingml/2006/main">
+              <a:graphicData uri="http://schemas.openxmlformats.org/drawingml/2006/picture">
+                <pic:pic xmlns:pic="http://schemas.openxmlformats.org/drawingml/2006/picture">
+                  <pic:nvPicPr>
+                    <pic:cNvPr id="0" name="image1.png"/>
+                    <pic:cNvPicPr preferRelativeResize="0"/>
+                  </pic:nvPicPr>
+                  <pic:blipFill>
+                    <a:blip r:embed="rId20"/>
+                    <a:srcRect/>
+                    <a:stretch>
+                      <a:fillRect/>
+                    </a:stretch>
+                  </pic:blipFill>
+                  <pic:spPr>
+                    <a:xfrm>
+                      <a:off x="0" y="0"/>
+                      <a:ext cx="6323960" cy="6517353"/>
+                    </a:xfrm>
+                    <a:prstGeom prst="rect">
+                      <a:avLst/>
+                    </a:prstGeom>
+                    <a:ln w="12700">
+                      <a:solidFill>
+                        <a:srgbClr val="000000"/>
+                      </a:solidFill>
+                      <a:prstDash val="solid"/>
+                    </a:ln>
+                  </pic:spPr>
+                </pic:pic>
+              </a:graphicData>
+            </a:graphic>
+          </wp:anchor>
+        </w:drawing>
+      </w:r>
     </w:p>
     <w:p>
       <w:pPr>
@@ -26494,6 +26520,122 @@
     </w:lvl>
   </w:abstractNum>
   <w:abstractNum w:abstractNumId="35" w15:restartNumberingAfterBreak="0">
+    <w:nsid w:val="428B2124"/>
+    <w:multiLevelType w:val="multilevel"/>
+    <w:tmpl w:val="2DF6994C"/>
+    <w:lvl w:ilvl="0">
+      <w:start w:val="1"/>
+      <w:numFmt w:val="lowerLetter"/>
+      <w:lvlText w:val="%1."/>
+      <w:lvlJc w:val="left"/>
+      <w:pPr>
+        <w:ind w:left="1440" w:hanging="360"/>
+      </w:pPr>
+      <w:rPr>
+        <w:rFonts w:ascii="Arial" w:eastAsia="Arial" w:hAnsi="Arial" w:cs="Arial"/>
+        <w:b/>
+        <w:bCs/>
+        <w:u w:val="none"/>
+      </w:rPr>
+    </w:lvl>
+    <w:lvl w:ilvl="1">
+      <w:start w:val="1"/>
+      <w:numFmt w:val="lowerRoman"/>
+      <w:lvlText w:val="%2."/>
+      <w:lvlJc w:val="right"/>
+      <w:pPr>
+        <w:ind w:left="2160" w:hanging="360"/>
+      </w:pPr>
+      <w:rPr>
+        <w:u w:val="none"/>
+      </w:rPr>
+    </w:lvl>
+    <w:lvl w:ilvl="2">
+      <w:start w:val="1"/>
+      <w:numFmt w:val="decimal"/>
+      <w:lvlText w:val="%3."/>
+      <w:lvlJc w:val="left"/>
+      <w:pPr>
+        <w:ind w:left="2880" w:hanging="360"/>
+      </w:pPr>
+      <w:rPr>
+        <w:u w:val="none"/>
+      </w:rPr>
+    </w:lvl>
+    <w:lvl w:ilvl="3">
+      <w:start w:val="1"/>
+      <w:numFmt w:val="lowerLetter"/>
+      <w:lvlText w:val="%4."/>
+      <w:lvlJc w:val="left"/>
+      <w:pPr>
+        <w:ind w:left="3600" w:hanging="360"/>
+      </w:pPr>
+      <w:rPr>
+        <w:u w:val="none"/>
+      </w:rPr>
+    </w:lvl>
+    <w:lvl w:ilvl="4">
+      <w:start w:val="1"/>
+      <w:numFmt w:val="lowerRoman"/>
+      <w:lvlText w:val="%5."/>
+      <w:lvlJc w:val="right"/>
+      <w:pPr>
+        <w:ind w:left="4320" w:hanging="360"/>
+      </w:pPr>
+      <w:rPr>
+        <w:u w:val="none"/>
+      </w:rPr>
+    </w:lvl>
+    <w:lvl w:ilvl="5">
+      <w:start w:val="1"/>
+      <w:numFmt w:val="decimal"/>
+      <w:lvlText w:val="%6."/>
+      <w:lvlJc w:val="left"/>
+      <w:pPr>
+        <w:ind w:left="5040" w:hanging="360"/>
+      </w:pPr>
+      <w:rPr>
+        <w:u w:val="none"/>
+      </w:rPr>
+    </w:lvl>
+    <w:lvl w:ilvl="6">
+      <w:start w:val="1"/>
+      <w:numFmt w:val="lowerLetter"/>
+      <w:lvlText w:val="%7."/>
+      <w:lvlJc w:val="left"/>
+      <w:pPr>
+        <w:ind w:left="5760" w:hanging="360"/>
+      </w:pPr>
+      <w:rPr>
+        <w:u w:val="none"/>
+      </w:rPr>
+    </w:lvl>
+    <w:lvl w:ilvl="7">
+      <w:start w:val="1"/>
+      <w:numFmt w:val="lowerRoman"/>
+      <w:lvlText w:val="%8."/>
+      <w:lvlJc w:val="right"/>
+      <w:pPr>
+        <w:ind w:left="6480" w:hanging="360"/>
+      </w:pPr>
+      <w:rPr>
+        <w:u w:val="none"/>
+      </w:rPr>
+    </w:lvl>
+    <w:lvl w:ilvl="8">
+      <w:start w:val="1"/>
+      <w:numFmt w:val="decimal"/>
+      <w:lvlText w:val="%9."/>
+      <w:lvlJc w:val="left"/>
+      <w:pPr>
+        <w:ind w:left="7200" w:hanging="360"/>
+      </w:pPr>
+      <w:rPr>
+        <w:u w:val="none"/>
+      </w:rPr>
+    </w:lvl>
+  </w:abstractNum>
+  <w:abstractNum w:abstractNumId="36" w15:restartNumberingAfterBreak="0">
     <w:nsid w:val="42C95333"/>
     <w:multiLevelType w:val="multilevel"/>
     <w:tmpl w:val="148805BE"/>
@@ -26606,7 +26748,7 @@
       </w:rPr>
     </w:lvl>
   </w:abstractNum>
-  <w:abstractNum w:abstractNumId="36" w15:restartNumberingAfterBreak="0">
+  <w:abstractNum w:abstractNumId="37" w15:restartNumberingAfterBreak="0">
     <w:nsid w:val="43181F87"/>
     <w:multiLevelType w:val="multilevel"/>
     <w:tmpl w:val="7F38F270"/>
@@ -26719,7 +26861,7 @@
       </w:rPr>
     </w:lvl>
   </w:abstractNum>
-  <w:abstractNum w:abstractNumId="37" w15:restartNumberingAfterBreak="0">
+  <w:abstractNum w:abstractNumId="38" w15:restartNumberingAfterBreak="0">
     <w:nsid w:val="448443F5"/>
     <w:multiLevelType w:val="multilevel"/>
     <w:tmpl w:val="952E736C"/>
@@ -26832,7 +26974,7 @@
       </w:rPr>
     </w:lvl>
   </w:abstractNum>
-  <w:abstractNum w:abstractNumId="38" w15:restartNumberingAfterBreak="0">
+  <w:abstractNum w:abstractNumId="39" w15:restartNumberingAfterBreak="0">
     <w:nsid w:val="458E0EA2"/>
     <w:multiLevelType w:val="multilevel"/>
     <w:tmpl w:val="3F5CFCF4"/>
@@ -26945,7 +27087,7 @@
       </w:rPr>
     </w:lvl>
   </w:abstractNum>
-  <w:abstractNum w:abstractNumId="39" w15:restartNumberingAfterBreak="0">
+  <w:abstractNum w:abstractNumId="40" w15:restartNumberingAfterBreak="0">
     <w:nsid w:val="465317B8"/>
     <w:multiLevelType w:val="multilevel"/>
     <w:tmpl w:val="6BA6416E"/>
@@ -27058,7 +27200,7 @@
       </w:rPr>
     </w:lvl>
   </w:abstractNum>
-  <w:abstractNum w:abstractNumId="40" w15:restartNumberingAfterBreak="0">
+  <w:abstractNum w:abstractNumId="41" w15:restartNumberingAfterBreak="0">
     <w:nsid w:val="48547997"/>
     <w:multiLevelType w:val="multilevel"/>
     <w:tmpl w:val="B882F8C8"/>
@@ -27171,7 +27313,7 @@
       </w:rPr>
     </w:lvl>
   </w:abstractNum>
-  <w:abstractNum w:abstractNumId="41" w15:restartNumberingAfterBreak="0">
+  <w:abstractNum w:abstractNumId="42" w15:restartNumberingAfterBreak="0">
     <w:nsid w:val="496F6DCE"/>
     <w:multiLevelType w:val="multilevel"/>
     <w:tmpl w:val="ABE63494"/>
@@ -27285,7 +27427,7 @@
       </w:rPr>
     </w:lvl>
   </w:abstractNum>
-  <w:abstractNum w:abstractNumId="42" w15:restartNumberingAfterBreak="0">
+  <w:abstractNum w:abstractNumId="43" w15:restartNumberingAfterBreak="0">
     <w:nsid w:val="4A4D2AF6"/>
     <w:multiLevelType w:val="multilevel"/>
     <w:tmpl w:val="90BAD52C"/>
@@ -27398,7 +27540,7 @@
       </w:rPr>
     </w:lvl>
   </w:abstractNum>
-  <w:abstractNum w:abstractNumId="43" w15:restartNumberingAfterBreak="0">
+  <w:abstractNum w:abstractNumId="44" w15:restartNumberingAfterBreak="0">
     <w:nsid w:val="4D6144FA"/>
     <w:multiLevelType w:val="multilevel"/>
     <w:tmpl w:val="EFE4B066"/>
@@ -27511,7 +27653,7 @@
       </w:rPr>
     </w:lvl>
   </w:abstractNum>
-  <w:abstractNum w:abstractNumId="44" w15:restartNumberingAfterBreak="0">
+  <w:abstractNum w:abstractNumId="45" w15:restartNumberingAfterBreak="0">
     <w:nsid w:val="50B03E75"/>
     <w:multiLevelType w:val="multilevel"/>
     <w:tmpl w:val="BB66E540"/>
@@ -27627,7 +27769,7 @@
       </w:rPr>
     </w:lvl>
   </w:abstractNum>
-  <w:abstractNum w:abstractNumId="45" w15:restartNumberingAfterBreak="0">
+  <w:abstractNum w:abstractNumId="46" w15:restartNumberingAfterBreak="0">
     <w:nsid w:val="50D37916"/>
     <w:multiLevelType w:val="multilevel"/>
     <w:tmpl w:val="07968866"/>
@@ -27740,7 +27882,7 @@
       </w:rPr>
     </w:lvl>
   </w:abstractNum>
-  <w:abstractNum w:abstractNumId="46" w15:restartNumberingAfterBreak="0">
+  <w:abstractNum w:abstractNumId="47" w15:restartNumberingAfterBreak="0">
     <w:nsid w:val="55710702"/>
     <w:multiLevelType w:val="multilevel"/>
     <w:tmpl w:val="07F457C2"/>
@@ -27853,7 +27995,7 @@
       </w:rPr>
     </w:lvl>
   </w:abstractNum>
-  <w:abstractNum w:abstractNumId="47" w15:restartNumberingAfterBreak="0">
+  <w:abstractNum w:abstractNumId="48" w15:restartNumberingAfterBreak="0">
     <w:nsid w:val="5BD11A94"/>
     <w:multiLevelType w:val="multilevel"/>
     <w:tmpl w:val="95C64B56"/>
@@ -27966,7 +28108,7 @@
       </w:rPr>
     </w:lvl>
   </w:abstractNum>
-  <w:abstractNum w:abstractNumId="48" w15:restartNumberingAfterBreak="0">
+  <w:abstractNum w:abstractNumId="49" w15:restartNumberingAfterBreak="0">
     <w:nsid w:val="5CCB2CC5"/>
     <w:multiLevelType w:val="multilevel"/>
     <w:tmpl w:val="5AC6F2E8"/>
@@ -28079,7 +28221,7 @@
       </w:rPr>
     </w:lvl>
   </w:abstractNum>
-  <w:abstractNum w:abstractNumId="49" w15:restartNumberingAfterBreak="0">
+  <w:abstractNum w:abstractNumId="50" w15:restartNumberingAfterBreak="0">
     <w:nsid w:val="5D3E6B0D"/>
     <w:multiLevelType w:val="multilevel"/>
     <w:tmpl w:val="4778422A"/>
@@ -28194,7 +28336,7 @@
       </w:rPr>
     </w:lvl>
   </w:abstractNum>
-  <w:abstractNum w:abstractNumId="50" w15:restartNumberingAfterBreak="0">
+  <w:abstractNum w:abstractNumId="51" w15:restartNumberingAfterBreak="0">
     <w:nsid w:val="5DDA5099"/>
     <w:multiLevelType w:val="multilevel"/>
     <w:tmpl w:val="7E4EF778"/>
@@ -28307,7 +28449,7 @@
       </w:rPr>
     </w:lvl>
   </w:abstractNum>
-  <w:abstractNum w:abstractNumId="51" w15:restartNumberingAfterBreak="0">
+  <w:abstractNum w:abstractNumId="52" w15:restartNumberingAfterBreak="0">
     <w:nsid w:val="5FB60E5D"/>
     <w:multiLevelType w:val="multilevel"/>
     <w:tmpl w:val="6568E506"/>
@@ -28420,7 +28562,7 @@
       </w:rPr>
     </w:lvl>
   </w:abstractNum>
-  <w:abstractNum w:abstractNumId="52" w15:restartNumberingAfterBreak="0">
+  <w:abstractNum w:abstractNumId="53" w15:restartNumberingAfterBreak="0">
     <w:nsid w:val="5FDF458E"/>
     <w:multiLevelType w:val="multilevel"/>
     <w:tmpl w:val="37365FD2"/>
@@ -28533,7 +28675,7 @@
       </w:rPr>
     </w:lvl>
   </w:abstractNum>
-  <w:abstractNum w:abstractNumId="53" w15:restartNumberingAfterBreak="0">
+  <w:abstractNum w:abstractNumId="54" w15:restartNumberingAfterBreak="0">
     <w:nsid w:val="5FE93E0C"/>
     <w:multiLevelType w:val="multilevel"/>
     <w:tmpl w:val="1F10268A"/>
@@ -28646,7 +28788,7 @@
       </w:rPr>
     </w:lvl>
   </w:abstractNum>
-  <w:abstractNum w:abstractNumId="54" w15:restartNumberingAfterBreak="0">
+  <w:abstractNum w:abstractNumId="55" w15:restartNumberingAfterBreak="0">
     <w:nsid w:val="613029C9"/>
     <w:multiLevelType w:val="multilevel"/>
     <w:tmpl w:val="65863AE2"/>
@@ -28761,7 +28903,7 @@
       </w:rPr>
     </w:lvl>
   </w:abstractNum>
-  <w:abstractNum w:abstractNumId="55" w15:restartNumberingAfterBreak="0">
+  <w:abstractNum w:abstractNumId="56" w15:restartNumberingAfterBreak="0">
     <w:nsid w:val="65036AE5"/>
     <w:multiLevelType w:val="multilevel"/>
     <w:tmpl w:val="326230D8"/>
@@ -28874,7 +29016,7 @@
       </w:rPr>
     </w:lvl>
   </w:abstractNum>
-  <w:abstractNum w:abstractNumId="56" w15:restartNumberingAfterBreak="0">
+  <w:abstractNum w:abstractNumId="57" w15:restartNumberingAfterBreak="0">
     <w:nsid w:val="6A3138FE"/>
     <w:multiLevelType w:val="multilevel"/>
     <w:tmpl w:val="41384D26"/>
@@ -28987,7 +29129,7 @@
       </w:rPr>
     </w:lvl>
   </w:abstractNum>
-  <w:abstractNum w:abstractNumId="57" w15:restartNumberingAfterBreak="0">
+  <w:abstractNum w:abstractNumId="58" w15:restartNumberingAfterBreak="0">
     <w:nsid w:val="6C7E7137"/>
     <w:multiLevelType w:val="multilevel"/>
     <w:tmpl w:val="57DABF68"/>
@@ -29101,7 +29243,7 @@
       </w:rPr>
     </w:lvl>
   </w:abstractNum>
-  <w:abstractNum w:abstractNumId="58" w15:restartNumberingAfterBreak="0">
+  <w:abstractNum w:abstractNumId="59" w15:restartNumberingAfterBreak="0">
     <w:nsid w:val="6E5913AB"/>
     <w:multiLevelType w:val="multilevel"/>
     <w:tmpl w:val="58BED0F4"/>
@@ -29217,7 +29359,7 @@
       </w:rPr>
     </w:lvl>
   </w:abstractNum>
-  <w:abstractNum w:abstractNumId="59" w15:restartNumberingAfterBreak="0">
+  <w:abstractNum w:abstractNumId="60" w15:restartNumberingAfterBreak="0">
     <w:nsid w:val="72805C41"/>
     <w:multiLevelType w:val="multilevel"/>
     <w:tmpl w:val="E9FE76CC"/>
@@ -29330,7 +29472,7 @@
       </w:rPr>
     </w:lvl>
   </w:abstractNum>
-  <w:abstractNum w:abstractNumId="60" w15:restartNumberingAfterBreak="0">
+  <w:abstractNum w:abstractNumId="61" w15:restartNumberingAfterBreak="0">
     <w:nsid w:val="7F9E14B6"/>
     <w:multiLevelType w:val="multilevel"/>
     <w:tmpl w:val="954CE9BC"/>
@@ -29453,10 +29595,10 @@
     <w:abstractNumId w:val="21"/>
   </w:num>
   <w:num w:numId="4" w16cid:durableId="1992826284">
-    <w:abstractNumId w:val="37"/>
+    <w:abstractNumId w:val="38"/>
   </w:num>
   <w:num w:numId="5" w16cid:durableId="556664739">
-    <w:abstractNumId w:val="49"/>
+    <w:abstractNumId w:val="50"/>
   </w:num>
   <w:num w:numId="6" w16cid:durableId="1487744149">
     <w:abstractNumId w:val="25"/>
@@ -29468,10 +29610,10 @@
     <w:abstractNumId w:val="1"/>
   </w:num>
   <w:num w:numId="9" w16cid:durableId="766116493">
-    <w:abstractNumId w:val="56"/>
+    <w:abstractNumId w:val="57"/>
   </w:num>
   <w:num w:numId="10" w16cid:durableId="1952399990">
-    <w:abstractNumId w:val="47"/>
+    <w:abstractNumId w:val="48"/>
   </w:num>
   <w:num w:numId="11" w16cid:durableId="37904137">
     <w:abstractNumId w:val="17"/>
@@ -29483,7 +29625,7 @@
     <w:abstractNumId w:val="28"/>
   </w:num>
   <w:num w:numId="14" w16cid:durableId="1630941227">
-    <w:abstractNumId w:val="58"/>
+    <w:abstractNumId w:val="59"/>
   </w:num>
   <w:num w:numId="15" w16cid:durableId="353772789">
     <w:abstractNumId w:val="0"/>
@@ -29498,16 +29640,16 @@
     <w:abstractNumId w:val="16"/>
   </w:num>
   <w:num w:numId="19" w16cid:durableId="938565075">
-    <w:abstractNumId w:val="55"/>
+    <w:abstractNumId w:val="56"/>
   </w:num>
   <w:num w:numId="20" w16cid:durableId="1835678066">
     <w:abstractNumId w:val="22"/>
   </w:num>
   <w:num w:numId="21" w16cid:durableId="1990208459">
-    <w:abstractNumId w:val="57"/>
+    <w:abstractNumId w:val="58"/>
   </w:num>
   <w:num w:numId="22" w16cid:durableId="600335297">
-    <w:abstractNumId w:val="50"/>
+    <w:abstractNumId w:val="51"/>
   </w:num>
   <w:num w:numId="23" w16cid:durableId="2054385142">
     <w:abstractNumId w:val="12"/>
@@ -29522,16 +29664,16 @@
     <w:abstractNumId w:val="15"/>
   </w:num>
   <w:num w:numId="27" w16cid:durableId="533923511">
-    <w:abstractNumId w:val="59"/>
+    <w:abstractNumId w:val="60"/>
   </w:num>
   <w:num w:numId="28" w16cid:durableId="1192449188">
-    <w:abstractNumId w:val="48"/>
+    <w:abstractNumId w:val="49"/>
   </w:num>
   <w:num w:numId="29" w16cid:durableId="1665281468">
     <w:abstractNumId w:val="18"/>
   </w:num>
   <w:num w:numId="30" w16cid:durableId="1040786868">
-    <w:abstractNumId w:val="54"/>
+    <w:abstractNumId w:val="55"/>
   </w:num>
   <w:num w:numId="31" w16cid:durableId="2126801092">
     <w:abstractNumId w:val="7"/>
@@ -29540,13 +29682,13 @@
     <w:abstractNumId w:val="11"/>
   </w:num>
   <w:num w:numId="33" w16cid:durableId="1721056414">
-    <w:abstractNumId w:val="43"/>
+    <w:abstractNumId w:val="44"/>
   </w:num>
   <w:num w:numId="34" w16cid:durableId="592857484">
     <w:abstractNumId w:val="30"/>
   </w:num>
   <w:num w:numId="35" w16cid:durableId="957687212">
-    <w:abstractNumId w:val="36"/>
+    <w:abstractNumId w:val="37"/>
   </w:num>
   <w:num w:numId="36" w16cid:durableId="1031036303">
     <w:abstractNumId w:val="9"/>
@@ -29555,34 +29697,34 @@
     <w:abstractNumId w:val="19"/>
   </w:num>
   <w:num w:numId="38" w16cid:durableId="1296636943">
-    <w:abstractNumId w:val="38"/>
+    <w:abstractNumId w:val="39"/>
   </w:num>
   <w:num w:numId="39" w16cid:durableId="2079159767">
-    <w:abstractNumId w:val="35"/>
+    <w:abstractNumId w:val="36"/>
   </w:num>
   <w:num w:numId="40" w16cid:durableId="925770437">
-    <w:abstractNumId w:val="60"/>
+    <w:abstractNumId w:val="61"/>
   </w:num>
   <w:num w:numId="41" w16cid:durableId="642152572">
-    <w:abstractNumId w:val="45"/>
+    <w:abstractNumId w:val="46"/>
   </w:num>
   <w:num w:numId="42" w16cid:durableId="549533451">
-    <w:abstractNumId w:val="53"/>
+    <w:abstractNumId w:val="54"/>
   </w:num>
   <w:num w:numId="43" w16cid:durableId="93936508">
     <w:abstractNumId w:val="2"/>
   </w:num>
   <w:num w:numId="44" w16cid:durableId="750663265">
+    <w:abstractNumId w:val="42"/>
+  </w:num>
+  <w:num w:numId="45" w16cid:durableId="227619477">
     <w:abstractNumId w:val="41"/>
   </w:num>
-  <w:num w:numId="45" w16cid:durableId="227619477">
-    <w:abstractNumId w:val="40"/>
-  </w:num>
   <w:num w:numId="46" w16cid:durableId="1503623810">
-    <w:abstractNumId w:val="42"/>
+    <w:abstractNumId w:val="43"/>
   </w:num>
   <w:num w:numId="47" w16cid:durableId="1563180017">
-    <w:abstractNumId w:val="39"/>
+    <w:abstractNumId w:val="40"/>
   </w:num>
   <w:num w:numId="48" w16cid:durableId="272784394">
     <w:abstractNumId w:val="5"/>
@@ -29606,25 +29748,28 @@
     <w:abstractNumId w:val="24"/>
   </w:num>
   <w:num w:numId="55" w16cid:durableId="1178740125">
-    <w:abstractNumId w:val="51"/>
+    <w:abstractNumId w:val="52"/>
   </w:num>
   <w:num w:numId="56" w16cid:durableId="1539002821">
     <w:abstractNumId w:val="6"/>
   </w:num>
   <w:num w:numId="57" w16cid:durableId="559751553">
-    <w:abstractNumId w:val="46"/>
+    <w:abstractNumId w:val="47"/>
   </w:num>
   <w:num w:numId="58" w16cid:durableId="497961378">
-    <w:abstractNumId w:val="44"/>
+    <w:abstractNumId w:val="45"/>
   </w:num>
   <w:num w:numId="59" w16cid:durableId="1157960435">
     <w:abstractNumId w:val="26"/>
   </w:num>
   <w:num w:numId="60" w16cid:durableId="1175458231">
-    <w:abstractNumId w:val="52"/>
+    <w:abstractNumId w:val="53"/>
   </w:num>
   <w:num w:numId="61" w16cid:durableId="248926020">
     <w:abstractNumId w:val="27"/>
+  </w:num>
+  <w:num w:numId="62" w16cid:durableId="381711517">
+    <w:abstractNumId w:val="35"/>
   </w:num>
   <w:numIdMacAtCleanup w:val="61"/>
 </w:numbering>

</xml_diff>